<commit_message>
docs: redraw report diagrams with stricter notation
</commit_message>
<xml_diff>
--- a/docs/党员发展管理小程序阶段性汇报（2026-04，插图版）.docx
+++ b/docs/党员发展管理小程序阶段性汇报（2026-04，插图版）.docx
@@ -2659,7 +2659,7 @@
         <w:pStyle w:val="FirstParagraph"/>
       </w:pPr>
       <w:r>
-        <w:t xml:space="preserve">以下数据流图采用正式插图方式表达，重点体现当前项目的业务数据主链路。</w:t>
+        <w:t xml:space="preserve">以下数据流图按标准 DFD 口径表达，区分外部实体、处理过程、数据存储和数据流，重点体现当前项目的业务主链路。</w:t>
       </w:r>
     </w:p>
     <w:p>
@@ -2788,7 +2788,7 @@
         <w:pStyle w:val="FirstParagraph"/>
       </w:pPr>
       <w:r>
-        <w:t xml:space="preserve">以下 ER 图为当前项目的核心实体关系简图，用于说明系统是否具备继续建设的数据库基础。</w:t>
+        <w:t xml:space="preserve">以下 ER 图按实体关系图严格口径表达，重点展示当前数据库结构中可以明确成立的主外键关系和核心基数关系。</w:t>
       </w:r>
     </w:p>
     <w:p>
@@ -2798,7 +2798,7 @@
       <w:r>
         <w:drawing>
           <wp:inline>
-            <wp:extent cx="5334000" cy="3733800"/>
+            <wp:extent cx="5334000" cy="3636818"/>
             <wp:effectExtent b="0" l="0" r="0" t="0"/>
             <wp:docPr descr="ER 图" title="" id="1" name="Picture"/>
             <a:graphic>
@@ -2819,7 +2819,7 @@
                   <pic:spPr bwMode="auto">
                     <a:xfrm>
                       <a:off x="0" y="0"/>
-                      <a:ext cx="5334000" cy="3733800"/>
+                      <a:ext cx="5334000" cy="3636818"/>
                     </a:xfrm>
                     <a:prstGeom prst="rect">
                       <a:avLst/>

</xml_diff>